<commit_message>
AWS Test prep, continued updates-Nov2025
</commit_message>
<xml_diff>
--- a/AWS_FreeTest0Quiz.docx
+++ b/AWS_FreeTest0Quiz.docx
@@ -99,7 +99,7 @@
     <w:p>
       <w:r>
         <w:pict w14:anchorId="6628A6D0">
-          <v:rect id="_x0000_i1805" style="width:0;height:0" o:hralign="center" o:hrstd="t" o:hrnoshade="t" o:hr="t" fillcolor="black" stroked="f"/>
+          <v:rect id="_x0000_i1025" style="width:0;height:0" o:hralign="center" o:hrstd="t" o:hrnoshade="t" o:hr="t" fillcolor="black" stroked="f"/>
         </w:pict>
       </w:r>
     </w:p>
@@ -211,7 +211,7 @@
     <w:p>
       <w:r>
         <w:pict w14:anchorId="40946B4E">
-          <v:rect id="_x0000_i1806" style="width:0;height:0" o:hralign="center" o:hrstd="t" o:hrnoshade="t" o:hr="t" fillcolor="black" stroked="f"/>
+          <v:rect id="_x0000_i1026" style="width:0;height:0" o:hralign="center" o:hrstd="t" o:hrnoshade="t" o:hr="t" fillcolor="black" stroked="f"/>
         </w:pict>
       </w:r>
     </w:p>
@@ -323,7 +323,7 @@
     <w:p>
       <w:r>
         <w:pict w14:anchorId="18E55ED6">
-          <v:rect id="_x0000_i1807" style="width:0;height:0" o:hralign="center" o:hrstd="t" o:hrnoshade="t" o:hr="t" fillcolor="black" stroked="f"/>
+          <v:rect id="_x0000_i1027" style="width:0;height:0" o:hralign="center" o:hrstd="t" o:hrnoshade="t" o:hr="t" fillcolor="black" stroked="f"/>
         </w:pict>
       </w:r>
     </w:p>
@@ -397,7 +397,7 @@
     <w:p>
       <w:r>
         <w:pict w14:anchorId="327406DE">
-          <v:rect id="_x0000_i1808" style="width:0;height:0" o:hralign="center" o:hrstd="t" o:hrnoshade="t" o:hr="t" fillcolor="black" stroked="f"/>
+          <v:rect id="_x0000_i1028" style="width:0;height:0" o:hralign="center" o:hrstd="t" o:hrnoshade="t" o:hr="t" fillcolor="black" stroked="f"/>
         </w:pict>
       </w:r>
     </w:p>
@@ -519,7 +519,7 @@
     <w:p>
       <w:r>
         <w:pict w14:anchorId="2838454C">
-          <v:rect id="_x0000_i1809" style="width:0;height:0" o:hralign="center" o:hrstd="t" o:hrnoshade="t" o:hr="t" fillcolor="black" stroked="f"/>
+          <v:rect id="_x0000_i1029" style="width:0;height:0" o:hralign="center" o:hrstd="t" o:hrnoshade="t" o:hr="t" fillcolor="black" stroked="f"/>
         </w:pict>
       </w:r>
     </w:p>
@@ -652,7 +652,7 @@
     <w:p>
       <w:r>
         <w:pict w14:anchorId="11C73580">
-          <v:rect id="_x0000_i1810" style="width:0;height:0" o:hralign="center" o:hrstd="t" o:hrnoshade="t" o:hr="t" fillcolor="black" stroked="f"/>
+          <v:rect id="_x0000_i1030" style="width:0;height:0" o:hralign="center" o:hrstd="t" o:hrnoshade="t" o:hr="t" fillcolor="black" stroked="f"/>
         </w:pict>
       </w:r>
     </w:p>
@@ -777,7 +777,7 @@
     <w:p>
       <w:r>
         <w:pict w14:anchorId="225C2E84">
-          <v:rect id="_x0000_i1811" style="width:0;height:0" o:hralign="center" o:hrstd="t" o:hrnoshade="t" o:hr="t" fillcolor="black" stroked="f"/>
+          <v:rect id="_x0000_i1031" style="width:0;height:0" o:hralign="center" o:hrstd="t" o:hrnoshade="t" o:hr="t" fillcolor="black" stroked="f"/>
         </w:pict>
       </w:r>
     </w:p>
@@ -933,7 +933,7 @@
     <w:p>
       <w:r>
         <w:pict w14:anchorId="45714E93">
-          <v:rect id="_x0000_i1812" style="width:0;height:0" o:hralign="center" o:hrstd="t" o:hrnoshade="t" o:hr="t" fillcolor="black" stroked="f"/>
+          <v:rect id="_x0000_i1032" style="width:0;height:0" o:hralign="center" o:hrstd="t" o:hrnoshade="t" o:hr="t" fillcolor="black" stroked="f"/>
         </w:pict>
       </w:r>
     </w:p>
@@ -1007,7 +1007,7 @@
     <w:p>
       <w:r>
         <w:pict w14:anchorId="26E04854">
-          <v:rect id="_x0000_i1813" style="width:0;height:0" o:hralign="center" o:hrstd="t" o:hrnoshade="t" o:hr="t" fillcolor="black" stroked="f"/>
+          <v:rect id="_x0000_i1033" style="width:0;height:0" o:hralign="center" o:hrstd="t" o:hrnoshade="t" o:hr="t" fillcolor="black" stroked="f"/>
         </w:pict>
       </w:r>
     </w:p>
@@ -1081,7 +1081,7 @@
     <w:p>
       <w:r>
         <w:pict w14:anchorId="054379B6">
-          <v:rect id="_x0000_i1814" style="width:0;height:0" o:hralign="center" o:hrstd="t" o:hrnoshade="t" o:hr="t" fillcolor="black" stroked="f"/>
+          <v:rect id="_x0000_i1034" style="width:0;height:0" o:hralign="center" o:hrstd="t" o:hrnoshade="t" o:hr="t" fillcolor="black" stroked="f"/>
         </w:pict>
       </w:r>
     </w:p>
@@ -1166,7 +1166,7 @@
     <w:p>
       <w:r>
         <w:pict w14:anchorId="08A101A1">
-          <v:rect id="_x0000_i1815" style="width:0;height:0" o:hralign="center" o:hrstd="t" o:hrnoshade="t" o:hr="t" fillcolor="black" stroked="f"/>
+          <v:rect id="_x0000_i1035" style="width:0;height:0" o:hralign="center" o:hrstd="t" o:hrnoshade="t" o:hr="t" fillcolor="black" stroked="f"/>
         </w:pict>
       </w:r>
     </w:p>
@@ -1275,7 +1275,7 @@
     <w:p>
       <w:r>
         <w:pict w14:anchorId="23C82E0B">
-          <v:rect id="_x0000_i1816" style="width:0;height:0" o:hralign="center" o:hrstd="t" o:hrnoshade="t" o:hr="t" fillcolor="black" stroked="f"/>
+          <v:rect id="_x0000_i1036" style="width:0;height:0" o:hralign="center" o:hrstd="t" o:hrnoshade="t" o:hr="t" fillcolor="black" stroked="f"/>
         </w:pict>
       </w:r>
     </w:p>
@@ -1349,7 +1349,7 @@
     <w:p>
       <w:r>
         <w:pict w14:anchorId="519B2A72">
-          <v:rect id="_x0000_i1817" style="width:0;height:0" o:hralign="center" o:hrstd="t" o:hrnoshade="t" o:hr="t" fillcolor="black" stroked="f"/>
+          <v:rect id="_x0000_i1037" style="width:0;height:0" o:hralign="center" o:hrstd="t" o:hrnoshade="t" o:hr="t" fillcolor="black" stroked="f"/>
         </w:pict>
       </w:r>
     </w:p>
@@ -1423,7 +1423,7 @@
     <w:p>
       <w:r>
         <w:pict w14:anchorId="48B83812">
-          <v:rect id="_x0000_i1818" style="width:0;height:0" o:hralign="center" o:hrstd="t" o:hrnoshade="t" o:hr="t" fillcolor="black" stroked="f"/>
+          <v:rect id="_x0000_i1038" style="width:0;height:0" o:hralign="center" o:hrstd="t" o:hrnoshade="t" o:hr="t" fillcolor="black" stroked="f"/>
         </w:pict>
       </w:r>
     </w:p>
@@ -1519,7 +1519,7 @@
     <w:p>
       <w:r>
         <w:pict w14:anchorId="5E4BF084">
-          <v:rect id="_x0000_i1819" style="width:0;height:0" o:hralign="center" o:hrstd="t" o:hrnoshade="t" o:hr="t" fillcolor="black" stroked="f"/>
+          <v:rect id="_x0000_i1039" style="width:0;height:0" o:hralign="center" o:hrstd="t" o:hrnoshade="t" o:hr="t" fillcolor="black" stroked="f"/>
         </w:pict>
       </w:r>
     </w:p>
@@ -1593,7 +1593,7 @@
     <w:p>
       <w:r>
         <w:pict w14:anchorId="2256D9F6">
-          <v:rect id="_x0000_i1820" style="width:0;height:0" o:hralign="center" o:hrstd="t" o:hrnoshade="t" o:hr="t" fillcolor="black" stroked="f"/>
+          <v:rect id="_x0000_i1040" style="width:0;height:0" o:hralign="center" o:hrstd="t" o:hrnoshade="t" o:hr="t" fillcolor="black" stroked="f"/>
         </w:pict>
       </w:r>
     </w:p>
@@ -1667,7 +1667,7 @@
     <w:p>
       <w:r>
         <w:pict w14:anchorId="78F47C51">
-          <v:rect id="_x0000_i1821" style="width:0;height:0" o:hralign="center" o:hrstd="t" o:hrnoshade="t" o:hr="t" fillcolor="black" stroked="f"/>
+          <v:rect id="_x0000_i1041" style="width:0;height:0" o:hralign="center" o:hrstd="t" o:hrnoshade="t" o:hr="t" fillcolor="black" stroked="f"/>
         </w:pict>
       </w:r>
     </w:p>
@@ -1752,7 +1752,7 @@
     <w:p>
       <w:r>
         <w:pict w14:anchorId="56523A58">
-          <v:rect id="_x0000_i1822" style="width:0;height:0" o:hralign="center" o:hrstd="t" o:hrnoshade="t" o:hr="t" fillcolor="black" stroked="f"/>
+          <v:rect id="_x0000_i1042" style="width:0;height:0" o:hralign="center" o:hrstd="t" o:hrnoshade="t" o:hr="t" fillcolor="black" stroked="f"/>
         </w:pict>
       </w:r>
     </w:p>
@@ -1826,7 +1826,7 @@
     <w:p>
       <w:r>
         <w:pict w14:anchorId="2B9512D1">
-          <v:rect id="_x0000_i1823" style="width:0;height:0" o:hralign="center" o:hrstd="t" o:hrnoshade="t" o:hr="t" fillcolor="black" stroked="f"/>
+          <v:rect id="_x0000_i1043" style="width:0;height:0" o:hralign="center" o:hrstd="t" o:hrnoshade="t" o:hr="t" fillcolor="black" stroked="f"/>
         </w:pict>
       </w:r>
     </w:p>
@@ -1922,7 +1922,7 @@
     <w:p>
       <w:r>
         <w:pict w14:anchorId="10FFB565">
-          <v:rect id="_x0000_i1824" style="width:0;height:0" o:hralign="center" o:hrstd="t" o:hrnoshade="t" o:hr="t" fillcolor="black" stroked="f"/>
+          <v:rect id="_x0000_i1044" style="width:0;height:0" o:hralign="center" o:hrstd="t" o:hrnoshade="t" o:hr="t" fillcolor="black" stroked="f"/>
         </w:pict>
       </w:r>
     </w:p>
@@ -1996,7 +1996,7 @@
     <w:p>
       <w:r>
         <w:pict w14:anchorId="3CDE9286">
-          <v:rect id="_x0000_i1825" style="width:0;height:0" o:hralign="center" o:hrstd="t" o:hrnoshade="t" o:hr="t" fillcolor="black" stroked="f"/>
+          <v:rect id="_x0000_i1045" style="width:0;height:0" o:hralign="center" o:hrstd="t" o:hrnoshade="t" o:hr="t" fillcolor="black" stroked="f"/>
         </w:pict>
       </w:r>
     </w:p>
@@ -2108,7 +2108,7 @@
     <w:p>
       <w:r>
         <w:pict w14:anchorId="41A7E650">
-          <v:rect id="_x0000_i1826" style="width:0;height:0" o:hralign="center" o:hrstd="t" o:hrnoshade="t" o:hr="t" fillcolor="black" stroked="f"/>
+          <v:rect id="_x0000_i1046" style="width:0;height:0" o:hralign="center" o:hrstd="t" o:hrnoshade="t" o:hr="t" fillcolor="black" stroked="f"/>
         </w:pict>
       </w:r>
     </w:p>
@@ -2204,7 +2204,7 @@
     <w:p>
       <w:r>
         <w:pict w14:anchorId="613B576A">
-          <v:rect id="_x0000_i1827" style="width:0;height:0" o:hralign="center" o:hrstd="t" o:hrnoshade="t" o:hr="t" fillcolor="black" stroked="f"/>
+          <v:rect id="_x0000_i1047" style="width:0;height:0" o:hralign="center" o:hrstd="t" o:hrnoshade="t" o:hr="t" fillcolor="black" stroked="f"/>
         </w:pict>
       </w:r>
     </w:p>
@@ -2278,7 +2278,7 @@
     <w:p>
       <w:r>
         <w:pict w14:anchorId="3C955ADE">
-          <v:rect id="_x0000_i1828" style="width:0;height:0" o:hralign="center" o:hrstd="t" o:hrnoshade="t" o:hr="t" fillcolor="black" stroked="f"/>
+          <v:rect id="_x0000_i1048" style="width:0;height:0" o:hralign="center" o:hrstd="t" o:hrnoshade="t" o:hr="t" fillcolor="black" stroked="f"/>
         </w:pict>
       </w:r>
     </w:p>
@@ -2363,7 +2363,7 @@
     <w:p>
       <w:r>
         <w:pict w14:anchorId="48CBDCED">
-          <v:rect id="_x0000_i1829" style="width:0;height:0" o:hralign="center" o:hrstd="t" o:hrnoshade="t" o:hr="t" fillcolor="black" stroked="f"/>
+          <v:rect id="_x0000_i1049" style="width:0;height:0" o:hralign="center" o:hrstd="t" o:hrnoshade="t" o:hr="t" fillcolor="black" stroked="f"/>
         </w:pict>
       </w:r>
     </w:p>
@@ -2448,7 +2448,7 @@
     <w:p>
       <w:r>
         <w:pict w14:anchorId="4FE7479D">
-          <v:rect id="_x0000_i1830" style="width:0;height:0" o:hralign="center" o:hrstd="t" o:hrnoshade="t" o:hr="t" fillcolor="black" stroked="f"/>
+          <v:rect id="_x0000_i1050" style="width:0;height:0" o:hralign="center" o:hrstd="t" o:hrnoshade="t" o:hr="t" fillcolor="black" stroked="f"/>
         </w:pict>
       </w:r>
     </w:p>
@@ -2544,7 +2544,7 @@
     <w:p>
       <w:r>
         <w:pict w14:anchorId="76B331DE">
-          <v:rect id="_x0000_i1831" style="width:0;height:0" o:hralign="center" o:hrstd="t" o:hrnoshade="t" o:hr="t" fillcolor="black" stroked="f"/>
+          <v:rect id="_x0000_i1051" style="width:0;height:0" o:hralign="center" o:hrstd="t" o:hrnoshade="t" o:hr="t" fillcolor="black" stroked="f"/>
         </w:pict>
       </w:r>
     </w:p>
@@ -2618,7 +2618,7 @@
     <w:p>
       <w:r>
         <w:pict w14:anchorId="538CF7B3">
-          <v:rect id="_x0000_i1832" style="width:0;height:0" o:hralign="center" o:hrstd="t" o:hrnoshade="t" o:hr="t" fillcolor="black" stroked="f"/>
+          <v:rect id="_x0000_i1052" style="width:0;height:0" o:hralign="center" o:hrstd="t" o:hrnoshade="t" o:hr="t" fillcolor="black" stroked="f"/>
         </w:pict>
       </w:r>
     </w:p>
@@ -2758,7 +2758,7 @@
     <w:p>
       <w:r>
         <w:pict w14:anchorId="62077726">
-          <v:rect id="_x0000_i1833" style="width:0;height:0" o:hralign="center" o:hrstd="t" o:hrnoshade="t" o:hr="t" fillcolor="black" stroked="f"/>
+          <v:rect id="_x0000_i1053" style="width:0;height:0" o:hralign="center" o:hrstd="t" o:hrnoshade="t" o:hr="t" fillcolor="black" stroked="f"/>
         </w:pict>
       </w:r>
     </w:p>
@@ -2854,7 +2854,7 @@
     <w:p>
       <w:r>
         <w:pict w14:anchorId="5372E6F0">
-          <v:rect id="_x0000_i1834" style="width:0;height:0" o:hralign="center" o:hrstd="t" o:hrnoshade="t" o:hr="t" fillcolor="black" stroked="f"/>
+          <v:rect id="_x0000_i1054" style="width:0;height:0" o:hralign="center" o:hrstd="t" o:hrnoshade="t" o:hr="t" fillcolor="black" stroked="f"/>
         </w:pict>
       </w:r>
     </w:p>
@@ -2950,7 +2950,7 @@
     <w:p>
       <w:r>
         <w:pict w14:anchorId="7A1261DF">
-          <v:rect id="_x0000_i1835" style="width:0;height:0" o:hralign="center" o:hrstd="t" o:hrnoshade="t" o:hr="t" fillcolor="black" stroked="f"/>
+          <v:rect id="_x0000_i1055" style="width:0;height:0" o:hralign="center" o:hrstd="t" o:hrnoshade="t" o:hr="t" fillcolor="black" stroked="f"/>
         </w:pict>
       </w:r>
     </w:p>
@@ -3062,7 +3062,7 @@
     <w:p>
       <w:r>
         <w:pict w14:anchorId="2E419C4D">
-          <v:rect id="_x0000_i1836" style="width:0;height:0" o:hralign="center" o:hrstd="t" o:hrnoshade="t" o:hr="t" fillcolor="black" stroked="f"/>
+          <v:rect id="_x0000_i1056" style="width:0;height:0" o:hralign="center" o:hrstd="t" o:hrnoshade="t" o:hr="t" fillcolor="black" stroked="f"/>
         </w:pict>
       </w:r>
     </w:p>
@@ -3158,7 +3158,7 @@
     <w:p>
       <w:r>
         <w:pict w14:anchorId="26160C38">
-          <v:rect id="_x0000_i1837" style="width:0;height:0" o:hralign="center" o:hrstd="t" o:hrnoshade="t" o:hr="t" fillcolor="black" stroked="f"/>
+          <v:rect id="_x0000_i1057" style="width:0;height:0" o:hralign="center" o:hrstd="t" o:hrnoshade="t" o:hr="t" fillcolor="black" stroked="f"/>
         </w:pict>
       </w:r>
     </w:p>
@@ -3243,7 +3243,7 @@
     <w:p>
       <w:r>
         <w:pict w14:anchorId="36DF7671">
-          <v:rect id="_x0000_i1838" style="width:0;height:0" o:hralign="center" o:hrstd="t" o:hrnoshade="t" o:hr="t" fillcolor="black" stroked="f"/>
+          <v:rect id="_x0000_i1058" style="width:0;height:0" o:hralign="center" o:hrstd="t" o:hrnoshade="t" o:hr="t" fillcolor="black" stroked="f"/>
         </w:pict>
       </w:r>
     </w:p>
@@ -3328,7 +3328,7 @@
     <w:p>
       <w:r>
         <w:pict w14:anchorId="35CFAC6F">
-          <v:rect id="_x0000_i1839" style="width:0;height:0" o:hralign="center" o:hrstd="t" o:hrnoshade="t" o:hr="t" fillcolor="black" stroked="f"/>
+          <v:rect id="_x0000_i1059" style="width:0;height:0" o:hralign="center" o:hrstd="t" o:hrnoshade="t" o:hr="t" fillcolor="black" stroked="f"/>
         </w:pict>
       </w:r>
     </w:p>
@@ -3410,7 +3410,7 @@
     <w:p>
       <w:r>
         <w:pict w14:anchorId="7B1700ED">
-          <v:rect id="_x0000_i1840" style="width:0;height:0" o:hralign="center" o:hrstd="t" o:hrnoshade="t" o:hr="t" fillcolor="black" stroked="f"/>
+          <v:rect id="_x0000_i1060" style="width:0;height:0" o:hralign="center" o:hrstd="t" o:hrnoshade="t" o:hr="t" fillcolor="black" stroked="f"/>
         </w:pict>
       </w:r>
     </w:p>
@@ -3539,7 +3539,7 @@
     <w:p>
       <w:r>
         <w:pict w14:anchorId="3C8B85CD">
-          <v:rect id="_x0000_i1841" style="width:0;height:0" o:hralign="center" o:hrstd="t" o:hrnoshade="t" o:hr="t" fillcolor="black" stroked="f"/>
+          <v:rect id="_x0000_i1061" style="width:0;height:0" o:hralign="center" o:hrstd="t" o:hrnoshade="t" o:hr="t" fillcolor="black" stroked="f"/>
         </w:pict>
       </w:r>
     </w:p>
@@ -3624,7 +3624,7 @@
     <w:p>
       <w:r>
         <w:pict w14:anchorId="4F98CD22">
-          <v:rect id="_x0000_i1842" style="width:0;height:0" o:hralign="center" o:hrstd="t" o:hrnoshade="t" o:hr="t" fillcolor="black" stroked="f"/>
+          <v:rect id="_x0000_i1062" style="width:0;height:0" o:hralign="center" o:hrstd="t" o:hrnoshade="t" o:hr="t" fillcolor="black" stroked="f"/>
         </w:pict>
       </w:r>
     </w:p>
@@ -3709,7 +3709,7 @@
     <w:p>
       <w:r>
         <w:pict w14:anchorId="34026C04">
-          <v:rect id="_x0000_i1843" style="width:0;height:0" o:hralign="center" o:hrstd="t" o:hrnoshade="t" o:hr="t" fillcolor="black" stroked="f"/>
+          <v:rect id="_x0000_i1063" style="width:0;height:0" o:hralign="center" o:hrstd="t" o:hrnoshade="t" o:hr="t" fillcolor="black" stroked="f"/>
         </w:pict>
       </w:r>
     </w:p>
@@ -3818,7 +3818,7 @@
     <w:p>
       <w:r>
         <w:pict w14:anchorId="5BF6A70C">
-          <v:rect id="_x0000_i1844" style="width:0;height:0" o:hralign="center" o:hrstd="t" o:hrnoshade="t" o:hr="t" fillcolor="black" stroked="f"/>
+          <v:rect id="_x0000_i1064" style="width:0;height:0" o:hralign="center" o:hrstd="t" o:hrnoshade="t" o:hr="t" fillcolor="black" stroked="f"/>
         </w:pict>
       </w:r>
     </w:p>
@@ -3914,7 +3914,7 @@
     <w:p>
       <w:r>
         <w:pict w14:anchorId="20737025">
-          <v:rect id="_x0000_i1845" style="width:0;height:0" o:hralign="center" o:hrstd="t" o:hrnoshade="t" o:hr="t" fillcolor="black" stroked="f"/>
+          <v:rect id="_x0000_i1065" style="width:0;height:0" o:hralign="center" o:hrstd="t" o:hrnoshade="t" o:hr="t" fillcolor="black" stroked="f"/>
         </w:pict>
       </w:r>
     </w:p>
@@ -4010,7 +4010,7 @@
     <w:p>
       <w:r>
         <w:pict w14:anchorId="07A20DCB">
-          <v:rect id="_x0000_i1846" style="width:0;height:0" o:hralign="center" o:hrstd="t" o:hrnoshade="t" o:hr="t" fillcolor="black" stroked="f"/>
+          <v:rect id="_x0000_i1066" style="width:0;height:0" o:hralign="center" o:hrstd="t" o:hrnoshade="t" o:hr="t" fillcolor="black" stroked="f"/>
         </w:pict>
       </w:r>
     </w:p>
@@ -4106,7 +4106,7 @@
     <w:p>
       <w:r>
         <w:pict w14:anchorId="6EF7C9C2">
-          <v:rect id="_x0000_i1847" style="width:0;height:0" o:hralign="center" o:hrstd="t" o:hrnoshade="t" o:hr="t" fillcolor="black" stroked="f"/>
+          <v:rect id="_x0000_i1067" style="width:0;height:0" o:hralign="center" o:hrstd="t" o:hrnoshade="t" o:hr="t" fillcolor="black" stroked="f"/>
         </w:pict>
       </w:r>
     </w:p>
@@ -4180,7 +4180,7 @@
     <w:p>
       <w:r>
         <w:pict w14:anchorId="33040D57">
-          <v:rect id="_x0000_i1848" style="width:0;height:0" o:hralign="center" o:hrstd="t" o:hrnoshade="t" o:hr="t" fillcolor="black" stroked="f"/>
+          <v:rect id="_x0000_i1068" style="width:0;height:0" o:hralign="center" o:hrstd="t" o:hrnoshade="t" o:hr="t" fillcolor="black" stroked="f"/>
         </w:pict>
       </w:r>
     </w:p>
@@ -4265,7 +4265,7 @@
     <w:p>
       <w:r>
         <w:pict w14:anchorId="3D8091CE">
-          <v:rect id="_x0000_i1849" style="width:0;height:0" o:hralign="center" o:hrstd="t" o:hrnoshade="t" o:hr="t" fillcolor="black" stroked="f"/>
+          <v:rect id="_x0000_i1069" style="width:0;height:0" o:hralign="center" o:hrstd="t" o:hrnoshade="t" o:hr="t" fillcolor="black" stroked="f"/>
         </w:pict>
       </w:r>
     </w:p>
@@ -4339,7 +4339,7 @@
     <w:p>
       <w:r>
         <w:pict w14:anchorId="08666574">
-          <v:rect id="_x0000_i1850" style="width:0;height:0" o:hralign="center" o:hrstd="t" o:hrnoshade="t" o:hr="t" fillcolor="black" stroked="f"/>
+          <v:rect id="_x0000_i1070" style="width:0;height:0" o:hralign="center" o:hrstd="t" o:hrnoshade="t" o:hr="t" fillcolor="black" stroked="f"/>
         </w:pict>
       </w:r>
     </w:p>
@@ -4413,7 +4413,7 @@
     <w:p>
       <w:r>
         <w:pict w14:anchorId="5B4ECFE8">
-          <v:rect id="_x0000_i1851" style="width:0;height:0" o:hralign="center" o:hrstd="t" o:hrnoshade="t" o:hr="t" fillcolor="black" stroked="f"/>
+          <v:rect id="_x0000_i1071" style="width:0;height:0" o:hralign="center" o:hrstd="t" o:hrnoshade="t" o:hr="t" fillcolor="black" stroked="f"/>
         </w:pict>
       </w:r>
     </w:p>
@@ -4498,7 +4498,7 @@
     <w:p>
       <w:r>
         <w:pict w14:anchorId="798ADD08">
-          <v:rect id="_x0000_i1852" style="width:0;height:0" o:hralign="center" o:hrstd="t" o:hrnoshade="t" o:hr="t" fillcolor="black" stroked="f"/>
+          <v:rect id="_x0000_i1072" style="width:0;height:0" o:hralign="center" o:hrstd="t" o:hrnoshade="t" o:hr="t" fillcolor="black" stroked="f"/>
         </w:pict>
       </w:r>
     </w:p>
@@ -4599,7 +4599,7 @@
     <w:p>
       <w:r>
         <w:pict w14:anchorId="5F4E6F5F">
-          <v:rect id="_x0000_i1853" style="width:0;height:0" o:hralign="center" o:hrstd="t" o:hrnoshade="t" o:hr="t" fillcolor="black" stroked="f"/>
+          <v:rect id="_x0000_i1073" style="width:0;height:0" o:hralign="center" o:hrstd="t" o:hrnoshade="t" o:hr="t" fillcolor="black" stroked="f"/>
         </w:pict>
       </w:r>
     </w:p>
@@ -4684,7 +4684,7 @@
     <w:p>
       <w:r>
         <w:pict w14:anchorId="5F1365E7">
-          <v:rect id="_x0000_i1854" style="width:0;height:0" o:hralign="center" o:hrstd="t" o:hrnoshade="t" o:hr="t" fillcolor="black" stroked="f"/>
+          <v:rect id="_x0000_i1074" style="width:0;height:0" o:hralign="center" o:hrstd="t" o:hrnoshade="t" o:hr="t" fillcolor="black" stroked="f"/>
         </w:pict>
       </w:r>
     </w:p>
@@ -4769,7 +4769,7 @@
     <w:p>
       <w:r>
         <w:pict w14:anchorId="06393952">
-          <v:rect id="_x0000_i1855" style="width:0;height:0" o:hralign="center" o:hrstd="t" o:hrnoshade="t" o:hr="t" fillcolor="black" stroked="f"/>
+          <v:rect id="_x0000_i1075" style="width:0;height:0" o:hralign="center" o:hrstd="t" o:hrnoshade="t" o:hr="t" fillcolor="black" stroked="f"/>
         </w:pict>
       </w:r>
     </w:p>
@@ -4854,7 +4854,7 @@
     <w:p>
       <w:r>
         <w:pict w14:anchorId="5C58AF91">
-          <v:rect id="_x0000_i1856" style="width:0;height:0" o:hralign="center" o:hrstd="t" o:hrnoshade="t" o:hr="t" fillcolor="black" stroked="f"/>
+          <v:rect id="_x0000_i1076" style="width:0;height:0" o:hralign="center" o:hrstd="t" o:hrnoshade="t" o:hr="t" fillcolor="black" stroked="f"/>
         </w:pict>
       </w:r>
     </w:p>
@@ -4950,7 +4950,7 @@
     <w:p>
       <w:r>
         <w:pict w14:anchorId="51543108">
-          <v:rect id="_x0000_i1857" style="width:0;height:0" o:hralign="center" o:hrstd="t" o:hrnoshade="t" o:hr="t" fillcolor="black" stroked="f"/>
+          <v:rect id="_x0000_i1077" style="width:0;height:0" o:hralign="center" o:hrstd="t" o:hrnoshade="t" o:hr="t" fillcolor="black" stroked="f"/>
         </w:pict>
       </w:r>
     </w:p>
@@ -5090,11 +5090,17 @@
     <w:p>
       <w:r>
         <w:pict w14:anchorId="25E9D434">
-          <v:rect id="_x0000_i1858" style="width:0;height:0" o:hralign="center" o:hrstd="t" o:hrnoshade="t" o:hr="t" fillcolor="black" stroked="f"/>
+          <v:rect id="_x0000_i1078" style="width:0;height:0" o:hralign="center" o:hrstd="t" o:hrnoshade="t" o:hr="t" fillcolor="black" stroked="f"/>
         </w:pict>
       </w:r>
     </w:p>
     <w:p>
+      <w:pPr>
+        <w:rPr>
+          <w:b/>
+          <w:bCs/>
+        </w:rPr>
+      </w:pPr>
       <w:r>
         <w:rPr>
           <w:b/>
@@ -5102,7 +5108,15 @@
         </w:rPr>
         <w:t>55. Which pricing option is the finest when users want low cost and elasticity of EC2 without any long-standing assurance?</w:t>
       </w:r>
-    </w:p>
+      <w:r>
+        <w:rPr>
+          <w:b/>
+          <w:bCs/>
+        </w:rPr>
+        <w:tab/>
+      </w:r>
+    </w:p>
+    <w:p/>
     <w:p>
       <w:pPr>
         <w:numPr>
@@ -5186,7 +5200,7 @@
     <w:p>
       <w:r>
         <w:pict w14:anchorId="167E8FA2">
-          <v:rect id="_x0000_i1859" style="width:0;height:0" o:hralign="center" o:hrstd="t" o:hrnoshade="t" o:hr="t" fillcolor="black" stroked="f"/>
+          <v:rect id="_x0000_i1079" style="width:0;height:0" o:hralign="center" o:hrstd="t" o:hrnoshade="t" o:hr="t" fillcolor="black" stroked="f"/>
         </w:pict>
       </w:r>
     </w:p>
@@ -5282,7 +5296,7 @@
     <w:p>
       <w:r>
         <w:pict w14:anchorId="1058EAEF">
-          <v:rect id="_x0000_i1860" style="width:0;height:0" o:hralign="center" o:hrstd="t" o:hrnoshade="t" o:hr="t" fillcolor="black" stroked="f"/>
+          <v:rect id="_x0000_i1080" style="width:0;height:0" o:hralign="center" o:hrstd="t" o:hrnoshade="t" o:hr="t" fillcolor="black" stroked="f"/>
         </w:pict>
       </w:r>
     </w:p>
@@ -5411,7 +5425,7 @@
     <w:p>
       <w:r>
         <w:pict w14:anchorId="3E398554">
-          <v:rect id="_x0000_i1861" style="width:0;height:0" o:hralign="center" o:hrstd="t" o:hrnoshade="t" o:hr="t" fillcolor="black" stroked="f"/>
+          <v:rect id="_x0000_i1081" style="width:0;height:0" o:hralign="center" o:hrstd="t" o:hrnoshade="t" o:hr="t" fillcolor="black" stroked="f"/>
         </w:pict>
       </w:r>
     </w:p>
@@ -5496,7 +5510,7 @@
     <w:p>
       <w:r>
         <w:pict w14:anchorId="3FBCAB53">
-          <v:rect id="_x0000_i1862" style="width:0;height:0" o:hralign="center" o:hrstd="t" o:hrnoshade="t" o:hr="t" fillcolor="black" stroked="f"/>
+          <v:rect id="_x0000_i1082" style="width:0;height:0" o:hralign="center" o:hrstd="t" o:hrnoshade="t" o:hr="t" fillcolor="black" stroked="f"/>
         </w:pict>
       </w:r>
     </w:p>
@@ -5592,7 +5606,7 @@
     <w:p>
       <w:r>
         <w:pict w14:anchorId="440577C1">
-          <v:rect id="_x0000_i1863" style="width:0;height:0" o:hralign="center" o:hrstd="t" o:hrnoshade="t" o:hr="t" fillcolor="black" stroked="f"/>
+          <v:rect id="_x0000_i1083" style="width:0;height:0" o:hralign="center" o:hrstd="t" o:hrnoshade="t" o:hr="t" fillcolor="black" stroked="f"/>
         </w:pict>
       </w:r>
     </w:p>
@@ -5688,7 +5702,7 @@
     <w:p>
       <w:r>
         <w:pict w14:anchorId="20CFF078">
-          <v:rect id="_x0000_i1864" style="width:0;height:0" o:hralign="center" o:hrstd="t" o:hrnoshade="t" o:hr="t" fillcolor="black" stroked="f"/>
+          <v:rect id="_x0000_i1084" style="width:0;height:0" o:hralign="center" o:hrstd="t" o:hrnoshade="t" o:hr="t" fillcolor="black" stroked="f"/>
         </w:pict>
       </w:r>
     </w:p>
@@ -5784,7 +5798,7 @@
     <w:p>
       <w:r>
         <w:pict w14:anchorId="6448FEC3">
-          <v:rect id="_x0000_i1865" style="width:0;height:0" o:hralign="center" o:hrstd="t" o:hrnoshade="t" o:hr="t" fillcolor="black" stroked="f"/>
+          <v:rect id="_x0000_i1085" style="width:0;height:0" o:hralign="center" o:hrstd="t" o:hrnoshade="t" o:hr="t" fillcolor="black" stroked="f"/>
         </w:pict>
       </w:r>
     </w:p>
@@ -5880,7 +5894,7 @@
     <w:p>
       <w:r>
         <w:pict w14:anchorId="5F627081">
-          <v:rect id="_x0000_i1866" style="width:0;height:0" o:hralign="center" o:hrstd="t" o:hrnoshade="t" o:hr="t" fillcolor="black" stroked="f"/>
+          <v:rect id="_x0000_i1086" style="width:0;height:0" o:hralign="center" o:hrstd="t" o:hrnoshade="t" o:hr="t" fillcolor="black" stroked="f"/>
         </w:pict>
       </w:r>
     </w:p>
@@ -5973,7 +5987,7 @@
     <w:p>
       <w:r>
         <w:pict w14:anchorId="5E82F3C1">
-          <v:rect id="_x0000_i1867" style="width:0;height:0" o:hralign="center" o:hrstd="t" o:hrnoshade="t" o:hr="t" fillcolor="black" stroked="f"/>
+          <v:rect id="_x0000_i1087" style="width:0;height:0" o:hralign="center" o:hrstd="t" o:hrnoshade="t" o:hr="t" fillcolor="black" stroked="f"/>
         </w:pict>
       </w:r>
     </w:p>
@@ -6069,7 +6083,7 @@
     <w:p>
       <w:r>
         <w:pict w14:anchorId="60CE2CB8">
-          <v:rect id="_x0000_i1868" style="width:0;height:0" o:hralign="center" o:hrstd="t" o:hrnoshade="t" o:hr="t" fillcolor="black" stroked="f"/>
+          <v:rect id="_x0000_i1088" style="width:0;height:0" o:hralign="center" o:hrstd="t" o:hrnoshade="t" o:hr="t" fillcolor="black" stroked="f"/>
         </w:pict>
       </w:r>
     </w:p>
@@ -6165,7 +6179,7 @@
     <w:p>
       <w:r>
         <w:pict w14:anchorId="6096877A">
-          <v:rect id="_x0000_i1869" style="width:0;height:0" o:hralign="center" o:hrstd="t" o:hrnoshade="t" o:hr="t" fillcolor="black" stroked="f"/>
+          <v:rect id="_x0000_i1089" style="width:0;height:0" o:hralign="center" o:hrstd="t" o:hrnoshade="t" o:hr="t" fillcolor="black" stroked="f"/>
         </w:pict>
       </w:r>
     </w:p>
@@ -6250,7 +6264,7 @@
     <w:p>
       <w:r>
         <w:pict w14:anchorId="09D83E19">
-          <v:rect id="_x0000_i1870" style="width:0;height:0" o:hralign="center" o:hrstd="t" o:hrnoshade="t" o:hr="t" fillcolor="black" stroked="f"/>
+          <v:rect id="_x0000_i1090" style="width:0;height:0" o:hralign="center" o:hrstd="t" o:hrnoshade="t" o:hr="t" fillcolor="black" stroked="f"/>
         </w:pict>
       </w:r>
     </w:p>
@@ -6346,7 +6360,7 @@
     <w:p>
       <w:r>
         <w:pict w14:anchorId="47D2F257">
-          <v:rect id="_x0000_i1871" style="width:0;height:0" o:hralign="center" o:hrstd="t" o:hrnoshade="t" o:hr="t" fillcolor="black" stroked="f"/>
+          <v:rect id="_x0000_i1091" style="width:0;height:0" o:hralign="center" o:hrstd="t" o:hrnoshade="t" o:hr="t" fillcolor="black" stroked="f"/>
         </w:pict>
       </w:r>
     </w:p>
@@ -6420,7 +6434,7 @@
     <w:p>
       <w:r>
         <w:pict w14:anchorId="02A7C25C">
-          <v:rect id="_x0000_i1872" style="width:0;height:0" o:hralign="center" o:hrstd="t" o:hrnoshade="t" o:hr="t" fillcolor="black" stroked="f"/>
+          <v:rect id="_x0000_i1092" style="width:0;height:0" o:hralign="center" o:hrstd="t" o:hrnoshade="t" o:hr="t" fillcolor="black" stroked="f"/>
         </w:pict>
       </w:r>
     </w:p>
@@ -6516,7 +6530,7 @@
     <w:p>
       <w:r>
         <w:pict w14:anchorId="78D7F339">
-          <v:rect id="_x0000_i1873" style="width:0;height:0" o:hralign="center" o:hrstd="t" o:hrnoshade="t" o:hr="t" fillcolor="black" stroked="f"/>
+          <v:rect id="_x0000_i1093" style="width:0;height:0" o:hralign="center" o:hrstd="t" o:hrnoshade="t" o:hr="t" fillcolor="black" stroked="f"/>
         </w:pict>
       </w:r>
     </w:p>
@@ -6612,7 +6626,7 @@
     <w:p>
       <w:r>
         <w:pict w14:anchorId="0F9ACD92">
-          <v:rect id="_x0000_i1874" style="width:0;height:0" o:hralign="center" o:hrstd="t" o:hrnoshade="t" o:hr="t" fillcolor="black" stroked="f"/>
+          <v:rect id="_x0000_i1094" style="width:0;height:0" o:hralign="center" o:hrstd="t" o:hrnoshade="t" o:hr="t" fillcolor="black" stroked="f"/>
         </w:pict>
       </w:r>
     </w:p>
@@ -6697,7 +6711,7 @@
     <w:p>
       <w:r>
         <w:pict w14:anchorId="40CD07D2">
-          <v:rect id="_x0000_i1875" style="width:0;height:0" o:hralign="center" o:hrstd="t" o:hrnoshade="t" o:hr="t" fillcolor="black" stroked="f"/>
+          <v:rect id="_x0000_i1095" style="width:0;height:0" o:hralign="center" o:hrstd="t" o:hrnoshade="t" o:hr="t" fillcolor="black" stroked="f"/>
         </w:pict>
       </w:r>
     </w:p>
@@ -6782,7 +6796,7 @@
     <w:p>
       <w:r>
         <w:pict w14:anchorId="14B1DC75">
-          <v:rect id="_x0000_i1876" style="width:0;height:0" o:hralign="center" o:hrstd="t" o:hrnoshade="t" o:hr="t" fillcolor="black" stroked="f"/>
+          <v:rect id="_x0000_i1096" style="width:0;height:0" o:hralign="center" o:hrstd="t" o:hrnoshade="t" o:hr="t" fillcolor="black" stroked="f"/>
         </w:pict>
       </w:r>
     </w:p>
@@ -6889,7 +6903,7 @@
     <w:p>
       <w:r>
         <w:pict w14:anchorId="06632DD4">
-          <v:rect id="_x0000_i1877" style="width:0;height:0" o:hralign="center" o:hrstd="t" o:hrnoshade="t" o:hr="t" fillcolor="black" stroked="f"/>
+          <v:rect id="_x0000_i1097" style="width:0;height:0" o:hralign="center" o:hrstd="t" o:hrnoshade="t" o:hr="t" fillcolor="black" stroked="f"/>
         </w:pict>
       </w:r>
     </w:p>
@@ -6974,7 +6988,7 @@
     <w:p>
       <w:r>
         <w:pict w14:anchorId="25E1CFC5">
-          <v:rect id="_x0000_i1878" style="width:0;height:0" o:hralign="center" o:hrstd="t" o:hrnoshade="t" o:hr="t" fillcolor="black" stroked="f"/>
+          <v:rect id="_x0000_i1098" style="width:0;height:0" o:hralign="center" o:hrstd="t" o:hrnoshade="t" o:hr="t" fillcolor="black" stroked="f"/>
         </w:pict>
       </w:r>
     </w:p>
@@ -7078,7 +7092,7 @@
     <w:p>
       <w:r>
         <w:pict w14:anchorId="62EC836B">
-          <v:rect id="_x0000_i1879" style="width:0;height:0" o:hralign="center" o:hrstd="t" o:hrnoshade="t" o:hr="t" fillcolor="black" stroked="f"/>
+          <v:rect id="_x0000_i1099" style="width:0;height:0" o:hralign="center" o:hrstd="t" o:hrnoshade="t" o:hr="t" fillcolor="black" stroked="f"/>
         </w:pict>
       </w:r>
     </w:p>
@@ -7174,7 +7188,7 @@
     <w:p>
       <w:r>
         <w:pict w14:anchorId="267A8B52">
-          <v:rect id="_x0000_i1880" style="width:0;height:0" o:hralign="center" o:hrstd="t" o:hrnoshade="t" o:hr="t" fillcolor="black" stroked="f"/>
+          <v:rect id="_x0000_i1100" style="width:0;height:0" o:hralign="center" o:hrstd="t" o:hrnoshade="t" o:hr="t" fillcolor="black" stroked="f"/>
         </w:pict>
       </w:r>
     </w:p>
@@ -7259,7 +7273,7 @@
     <w:p>
       <w:r>
         <w:pict w14:anchorId="463F8E66">
-          <v:rect id="_x0000_i1881" style="width:0;height:0" o:hralign="center" o:hrstd="t" o:hrnoshade="t" o:hr="t" fillcolor="black" stroked="f"/>
+          <v:rect id="_x0000_i1101" style="width:0;height:0" o:hralign="center" o:hrstd="t" o:hrnoshade="t" o:hr="t" fillcolor="black" stroked="f"/>
         </w:pict>
       </w:r>
     </w:p>
@@ -7344,7 +7358,7 @@
     <w:p>
       <w:r>
         <w:pict w14:anchorId="0F46AF15">
-          <v:rect id="_x0000_i1882" style="width:0;height:0" o:hralign="center" o:hrstd="t" o:hrnoshade="t" o:hr="t" fillcolor="black" stroked="f"/>
+          <v:rect id="_x0000_i1102" style="width:0;height:0" o:hralign="center" o:hrstd="t" o:hrnoshade="t" o:hr="t" fillcolor="black" stroked="f"/>
         </w:pict>
       </w:r>
     </w:p>
@@ -7440,7 +7454,7 @@
     <w:p>
       <w:r>
         <w:pict w14:anchorId="25B76BCF">
-          <v:rect id="_x0000_i1883" style="width:0;height:0" o:hralign="center" o:hrstd="t" o:hrnoshade="t" o:hr="t" fillcolor="black" stroked="f"/>
+          <v:rect id="_x0000_i1103" style="width:0;height:0" o:hralign="center" o:hrstd="t" o:hrnoshade="t" o:hr="t" fillcolor="black" stroked="f"/>
         </w:pict>
       </w:r>
     </w:p>
@@ -7543,7 +7557,7 @@
     <w:p>
       <w:r>
         <w:pict w14:anchorId="08AF9A00">
-          <v:rect id="_x0000_i1884" style="width:0;height:0" o:hralign="center" o:hrstd="t" o:hrnoshade="t" o:hr="t" fillcolor="black" stroked="f"/>
+          <v:rect id="_x0000_i1104" style="width:0;height:0" o:hralign="center" o:hrstd="t" o:hrnoshade="t" o:hr="t" fillcolor="black" stroked="f"/>
         </w:pict>
       </w:r>
     </w:p>
@@ -7561,7 +7575,22 @@
           <w:bCs/>
         </w:rPr>
         <w:softHyphen/>
-        <w:t>____ Assigns IP addresses to domain names and handles domain name reservation?</w:t>
+        <w:t xml:space="preserve">____ </w:t>
+      </w:r>
+      <w:r>
+        <w:rPr>
+          <w:b/>
+          <w:bCs/>
+          <w:highlight w:val="yellow"/>
+        </w:rPr>
+        <w:t>Assigns IP</w:t>
+      </w:r>
+      <w:r>
+        <w:rPr>
+          <w:b/>
+          <w:bCs/>
+        </w:rPr>
+        <w:t xml:space="preserve"> addresses to domain names and handles domain name reservation?</w:t>
       </w:r>
     </w:p>
     <w:p>
@@ -7572,7 +7601,13 @@
         </w:numPr>
       </w:pPr>
       <w:r>
-        <w:t>Domain registrars</w:t>
+        <w:t xml:space="preserve">Domain </w:t>
+      </w:r>
+      <w:r>
+        <w:rPr>
+          <w:highlight w:val="yellow"/>
+        </w:rPr>
+        <w:t>registrars</w:t>
       </w:r>
     </w:p>
     <w:p>
@@ -7636,7 +7671,7 @@
     <w:p>
       <w:r>
         <w:pict w14:anchorId="53B3B582">
-          <v:rect id="_x0000_i1885" style="width:0;height:0" o:hralign="center" o:hrstd="t" o:hrnoshade="t" o:hr="t" fillcolor="black" stroked="f"/>
+          <v:rect id="_x0000_i1105" style="width:0;height:0" o:hralign="center" o:hrstd="t" o:hrnoshade="t" o:hr="t" fillcolor="black" stroked="f"/>
         </w:pict>
       </w:r>
     </w:p>
@@ -7646,7 +7681,17 @@
           <w:b/>
           <w:bCs/>
         </w:rPr>
-        <w:t>82. Which relational database is fault-tolerant, distributed, and a self-healing storage system that auto-scales up to 64 TB per database instance?</w:t>
+        <w:t xml:space="preserve">82. Which relational database is fault-tolerant, distributed, and a self-healing storage system that auto-scales up to 64 TB </w:t>
+      </w:r>
+      <w:r>
+        <w:t xml:space="preserve">per </w:t>
+      </w:r>
+      <w:r>
+        <w:rPr>
+          <w:b/>
+          <w:bCs/>
+        </w:rPr>
+        <w:t>database instance?</w:t>
       </w:r>
     </w:p>
     <w:p>
@@ -7732,7 +7777,7 @@
     <w:p>
       <w:r>
         <w:pict w14:anchorId="30472F51">
-          <v:rect id="_x0000_i1886" style="width:0;height:0" o:hralign="center" o:hrstd="t" o:hrnoshade="t" o:hr="t" fillcolor="black" stroked="f"/>
+          <v:rect id="_x0000_i1106" style="width:0;height:0" o:hralign="center" o:hrstd="t" o:hrnoshade="t" o:hr="t" fillcolor="black" stroked="f"/>
         </w:pict>
       </w:r>
     </w:p>
@@ -7806,7 +7851,7 @@
     <w:p>
       <w:r>
         <w:pict w14:anchorId="35EF1044">
-          <v:rect id="_x0000_i1887" style="width:0;height:0" o:hralign="center" o:hrstd="t" o:hrnoshade="t" o:hr="t" fillcolor="black" stroked="f"/>
+          <v:rect id="_x0000_i1107" style="width:0;height:0" o:hralign="center" o:hrstd="t" o:hrnoshade="t" o:hr="t" fillcolor="black" stroked="f"/>
         </w:pict>
       </w:r>
     </w:p>
@@ -7891,7 +7936,7 @@
     <w:p>
       <w:r>
         <w:pict w14:anchorId="2F4FD260">
-          <v:rect id="_x0000_i1888" style="width:0;height:0" o:hralign="center" o:hrstd="t" o:hrnoshade="t" o:hr="t" fillcolor="black" stroked="f"/>
+          <v:rect id="_x0000_i1108" style="width:0;height:0" o:hralign="center" o:hrstd="t" o:hrnoshade="t" o:hr="t" fillcolor="black" stroked="f"/>
         </w:pict>
       </w:r>
     </w:p>
@@ -7998,7 +8043,7 @@
     <w:p>
       <w:r>
         <w:pict w14:anchorId="24468644">
-          <v:rect id="_x0000_i1889" style="width:0;height:0" o:hralign="center" o:hrstd="t" o:hrnoshade="t" o:hr="t" fillcolor="black" stroked="f"/>
+          <v:rect id="_x0000_i1109" style="width:0;height:0" o:hralign="center" o:hrstd="t" o:hrnoshade="t" o:hr="t" fillcolor="black" stroked="f"/>
         </w:pict>
       </w:r>
     </w:p>
@@ -8072,7 +8117,7 @@
     <w:p>
       <w:r>
         <w:pict w14:anchorId="4099ACEE">
-          <v:rect id="_x0000_i1890" style="width:0;height:0" o:hralign="center" o:hrstd="t" o:hrnoshade="t" o:hr="t" fillcolor="black" stroked="f"/>
+          <v:rect id="_x0000_i1110" style="width:0;height:0" o:hralign="center" o:hrstd="t" o:hrnoshade="t" o:hr="t" fillcolor="black" stroked="f"/>
         </w:pict>
       </w:r>
     </w:p>
@@ -8179,7 +8224,7 @@
     <w:p>
       <w:r>
         <w:pict w14:anchorId="628BF236">
-          <v:rect id="_x0000_i1891" style="width:0;height:0" o:hralign="center" o:hrstd="t" o:hrnoshade="t" o:hr="t" fillcolor="black" stroked="f"/>
+          <v:rect id="_x0000_i1111" style="width:0;height:0" o:hralign="center" o:hrstd="t" o:hrnoshade="t" o:hr="t" fillcolor="black" stroked="f"/>
         </w:pict>
       </w:r>
     </w:p>
@@ -8253,7 +8298,7 @@
     <w:p>
       <w:r>
         <w:pict w14:anchorId="2DD7F3F6">
-          <v:rect id="_x0000_i1892" style="width:0;height:0" o:hralign="center" o:hrstd="t" o:hrnoshade="t" o:hr="t" fillcolor="black" stroked="f"/>
+          <v:rect id="_x0000_i1112" style="width:0;height:0" o:hralign="center" o:hrstd="t" o:hrnoshade="t" o:hr="t" fillcolor="black" stroked="f"/>
         </w:pict>
       </w:r>
     </w:p>
@@ -8327,7 +8372,7 @@
     <w:p>
       <w:r>
         <w:pict w14:anchorId="50B6DEE3">
-          <v:rect id="_x0000_i1893" style="width:0;height:0" o:hralign="center" o:hrstd="t" o:hrnoshade="t" o:hr="t" fillcolor="black" stroked="f"/>
+          <v:rect id="_x0000_i1113" style="width:0;height:0" o:hralign="center" o:hrstd="t" o:hrnoshade="t" o:hr="t" fillcolor="black" stroked="f"/>
         </w:pict>
       </w:r>
     </w:p>
@@ -8438,7 +8483,7 @@
     <w:p>
       <w:r>
         <w:pict w14:anchorId="12917EFD">
-          <v:rect id="_x0000_i1894" style="width:0;height:0" o:hralign="center" o:hrstd="t" o:hrnoshade="t" o:hr="t" fillcolor="black" stroked="f"/>
+          <v:rect id="_x0000_i1114" style="width:0;height:0" o:hralign="center" o:hrstd="t" o:hrnoshade="t" o:hr="t" fillcolor="black" stroked="f"/>
         </w:pict>
       </w:r>
     </w:p>
@@ -8534,7 +8579,7 @@
     <w:p>
       <w:r>
         <w:pict w14:anchorId="72C15F30">
-          <v:rect id="_x0000_i1895" style="width:0;height:0" o:hralign="center" o:hrstd="t" o:hrnoshade="t" o:hr="t" fillcolor="black" stroked="f"/>
+          <v:rect id="_x0000_i1115" style="width:0;height:0" o:hralign="center" o:hrstd="t" o:hrnoshade="t" o:hr="t" fillcolor="black" stroked="f"/>
         </w:pict>
       </w:r>
     </w:p>
@@ -8608,7 +8653,7 @@
     <w:p>
       <w:r>
         <w:pict w14:anchorId="7F6DA5E0">
-          <v:rect id="_x0000_i1896" style="width:0;height:0" o:hralign="center" o:hrstd="t" o:hrnoshade="t" o:hr="t" fillcolor="black" stroked="f"/>
+          <v:rect id="_x0000_i1116" style="width:0;height:0" o:hralign="center" o:hrstd="t" o:hrnoshade="t" o:hr="t" fillcolor="black" stroked="f"/>
         </w:pict>
       </w:r>
     </w:p>
@@ -8753,7 +8798,7 @@
     <w:p>
       <w:r>
         <w:pict w14:anchorId="2C8182E1">
-          <v:rect id="_x0000_i1897" style="width:0;height:0" o:hralign="center" o:hrstd="t" o:hrnoshade="t" o:hr="t" fillcolor="black" stroked="f"/>
+          <v:rect id="_x0000_i1117" style="width:0;height:0" o:hralign="center" o:hrstd="t" o:hrnoshade="t" o:hr="t" fillcolor="black" stroked="f"/>
         </w:pict>
       </w:r>
     </w:p>
@@ -8849,7 +8894,7 @@
     <w:p>
       <w:r>
         <w:pict w14:anchorId="7F86B8FE">
-          <v:rect id="_x0000_i1898" style="width:0;height:0" o:hralign="center" o:hrstd="t" o:hrnoshade="t" o:hr="t" fillcolor="black" stroked="f"/>
+          <v:rect id="_x0000_i1118" style="width:0;height:0" o:hralign="center" o:hrstd="t" o:hrnoshade="t" o:hr="t" fillcolor="black" stroked="f"/>
         </w:pict>
       </w:r>
     </w:p>
@@ -8939,7 +8984,7 @@
     <w:p>
       <w:r>
         <w:pict w14:anchorId="6E73DE82">
-          <v:rect id="_x0000_i1899" style="width:0;height:0" o:hralign="center" o:hrstd="t" o:hrnoshade="t" o:hr="t" fillcolor="black" stroked="f"/>
+          <v:rect id="_x0000_i1119" style="width:0;height:0" o:hralign="center" o:hrstd="t" o:hrnoshade="t" o:hr="t" fillcolor="black" stroked="f"/>
         </w:pict>
       </w:r>
     </w:p>
@@ -9047,7 +9092,7 @@
     <w:p>
       <w:r>
         <w:pict w14:anchorId="6E2C1357">
-          <v:rect id="_x0000_i1900" style="width:0;height:0" o:hralign="center" o:hrstd="t" o:hrnoshade="t" o:hr="t" fillcolor="black" stroked="f"/>
+          <v:rect id="_x0000_i1120" style="width:0;height:0" o:hralign="center" o:hrstd="t" o:hrnoshade="t" o:hr="t" fillcolor="black" stroked="f"/>
         </w:pict>
       </w:r>
     </w:p>
@@ -9165,7 +9210,7 @@
     <w:p>
       <w:r>
         <w:pict w14:anchorId="2BEEE306">
-          <v:rect id="_x0000_i1901" style="width:0;height:0" o:hralign="center" o:hrstd="t" o:hrnoshade="t" o:hr="t" fillcolor="black" stroked="f"/>
+          <v:rect id="_x0000_i1121" style="width:0;height:0" o:hralign="center" o:hrstd="t" o:hrnoshade="t" o:hr="t" fillcolor="black" stroked="f"/>
         </w:pict>
       </w:r>
     </w:p>
@@ -9239,7 +9284,7 @@
     <w:p>
       <w:r>
         <w:pict w14:anchorId="06881EBF">
-          <v:rect id="_x0000_i1902" style="width:0;height:0" o:hralign="center" o:hrstd="t" o:hrnoshade="t" o:hr="t" fillcolor="black" stroked="f"/>
+          <v:rect id="_x0000_i1122" style="width:0;height:0" o:hralign="center" o:hrstd="t" o:hrnoshade="t" o:hr="t" fillcolor="black" stroked="f"/>
         </w:pict>
       </w:r>
     </w:p>
@@ -9324,7 +9369,7 @@
     <w:p>
       <w:r>
         <w:pict w14:anchorId="2F103664">
-          <v:rect id="_x0000_i1903" style="width:0;height:0" o:hralign="center" o:hrstd="t" o:hrnoshade="t" o:hr="t" fillcolor="black" stroked="f"/>
+          <v:rect id="_x0000_i1123" style="width:0;height:0" o:hralign="center" o:hrstd="t" o:hrnoshade="t" o:hr="t" fillcolor="black" stroked="f"/>
         </w:pict>
       </w:r>
     </w:p>
@@ -9398,7 +9443,7 @@
     <w:p>
       <w:r>
         <w:pict w14:anchorId="1C036C3A">
-          <v:rect id="_x0000_i1904" style="width:0;height:0" o:hralign="center" o:hrstd="t" o:hrnoshade="t" o:hr="t" fillcolor="black" stroked="f"/>
+          <v:rect id="_x0000_i1124" style="width:0;height:0" o:hralign="center" o:hrstd="t" o:hrnoshade="t" o:hr="t" fillcolor="black" stroked="f"/>
         </w:pict>
       </w:r>
     </w:p>
@@ -9494,7 +9539,7 @@
     <w:p>
       <w:r>
         <w:pict w14:anchorId="4A5BB500">
-          <v:rect id="_x0000_i1905" style="width:0;height:0" o:hralign="center" o:hrstd="t" o:hrnoshade="t" o:hr="t" fillcolor="black" stroked="f"/>
+          <v:rect id="_x0000_i1125" style="width:0;height:0" o:hralign="center" o:hrstd="t" o:hrnoshade="t" o:hr="t" fillcolor="black" stroked="f"/>
         </w:pict>
       </w:r>
     </w:p>
@@ -9590,7 +9635,7 @@
     <w:p>
       <w:r>
         <w:pict w14:anchorId="3B3BA93A">
-          <v:rect id="_x0000_i1906" style="width:0;height:0" o:hralign="center" o:hrstd="t" o:hrnoshade="t" o:hr="t" fillcolor="black" stroked="f"/>
+          <v:rect id="_x0000_i1126" style="width:0;height:0" o:hralign="center" o:hrstd="t" o:hrnoshade="t" o:hr="t" fillcolor="black" stroked="f"/>
         </w:pict>
       </w:r>
     </w:p>
@@ -9664,7 +9709,7 @@
     <w:p>
       <w:r>
         <w:pict w14:anchorId="7AD7E2F2">
-          <v:rect id="_x0000_i1907" style="width:0;height:0" o:hralign="center" o:hrstd="t" o:hrnoshade="t" o:hr="t" fillcolor="black" stroked="f"/>
+          <v:rect id="_x0000_i1127" style="width:0;height:0" o:hralign="center" o:hrstd="t" o:hrnoshade="t" o:hr="t" fillcolor="black" stroked="f"/>
         </w:pict>
       </w:r>
     </w:p>
@@ -9738,7 +9783,7 @@
     <w:p>
       <w:r>
         <w:pict w14:anchorId="472A45B1">
-          <v:rect id="_x0000_i1908" style="width:0;height:0" o:hralign="center" o:hrstd="t" o:hrnoshade="t" o:hr="t" fillcolor="black" stroked="f"/>
+          <v:rect id="_x0000_i1128" style="width:0;height:0" o:hralign="center" o:hrstd="t" o:hrnoshade="t" o:hr="t" fillcolor="black" stroked="f"/>
         </w:pict>
       </w:r>
     </w:p>
@@ -9812,7 +9857,7 @@
     <w:p>
       <w:r>
         <w:pict w14:anchorId="3BC060CE">
-          <v:rect id="_x0000_i1909" style="width:0;height:0" o:hralign="center" o:hrstd="t" o:hrnoshade="t" o:hr="t" fillcolor="black" stroked="f"/>
+          <v:rect id="_x0000_i1129" style="width:0;height:0" o:hralign="center" o:hrstd="t" o:hrnoshade="t" o:hr="t" fillcolor="black" stroked="f"/>
         </w:pict>
       </w:r>
     </w:p>
@@ -9886,7 +9931,7 @@
     <w:p>
       <w:r>
         <w:pict w14:anchorId="5E4E9FF1">
-          <v:rect id="_x0000_i1910" style="width:0;height:0" o:hralign="center" o:hrstd="t" o:hrnoshade="t" o:hr="t" fillcolor="black" stroked="f"/>
+          <v:rect id="_x0000_i1130" style="width:0;height:0" o:hralign="center" o:hrstd="t" o:hrnoshade="t" o:hr="t" fillcolor="black" stroked="f"/>
         </w:pict>
       </w:r>
     </w:p>
@@ -9982,7 +10027,7 @@
     <w:p>
       <w:r>
         <w:pict w14:anchorId="095AC9FB">
-          <v:rect id="_x0000_i1911" style="width:0;height:0" o:hralign="center" o:hrstd="t" o:hrnoshade="t" o:hr="t" fillcolor="black" stroked="f"/>
+          <v:rect id="_x0000_i1131" style="width:0;height:0" o:hralign="center" o:hrstd="t" o:hrnoshade="t" o:hr="t" fillcolor="black" stroked="f"/>
         </w:pict>
       </w:r>
     </w:p>
@@ -10067,7 +10112,7 @@
     <w:p>
       <w:r>
         <w:pict w14:anchorId="7B034519">
-          <v:rect id="_x0000_i1912" style="width:0;height:0" o:hralign="center" o:hrstd="t" o:hrnoshade="t" o:hr="t" fillcolor="black" stroked="f"/>
+          <v:rect id="_x0000_i1132" style="width:0;height:0" o:hralign="center" o:hrstd="t" o:hrnoshade="t" o:hr="t" fillcolor="black" stroked="f"/>
         </w:pict>
       </w:r>
     </w:p>
@@ -10152,7 +10197,7 @@
     <w:p>
       <w:r>
         <w:pict w14:anchorId="477EC2A6">
-          <v:rect id="_x0000_i1913" style="width:0;height:0" o:hralign="center" o:hrstd="t" o:hrnoshade="t" o:hr="t" fillcolor="black" stroked="f"/>
+          <v:rect id="_x0000_i1133" style="width:0;height:0" o:hralign="center" o:hrstd="t" o:hrnoshade="t" o:hr="t" fillcolor="black" stroked="f"/>
         </w:pict>
       </w:r>
     </w:p>
@@ -10237,7 +10282,7 @@
     <w:p>
       <w:r>
         <w:pict w14:anchorId="64FE29CD">
-          <v:rect id="_x0000_i1914" style="width:0;height:0" o:hralign="center" o:hrstd="t" o:hrnoshade="t" o:hr="t" fillcolor="black" stroked="f"/>
+          <v:rect id="_x0000_i1134" style="width:0;height:0" o:hralign="center" o:hrstd="t" o:hrnoshade="t" o:hr="t" fillcolor="black" stroked="f"/>
         </w:pict>
       </w:r>
     </w:p>
@@ -10333,7 +10378,7 @@
     <w:p>
       <w:r>
         <w:pict w14:anchorId="059692F7">
-          <v:rect id="_x0000_i1915" style="width:0;height:0" o:hralign="center" o:hrstd="t" o:hrnoshade="t" o:hr="t" fillcolor="black" stroked="f"/>
+          <v:rect id="_x0000_i1135" style="width:0;height:0" o:hralign="center" o:hrstd="t" o:hrnoshade="t" o:hr="t" fillcolor="black" stroked="f"/>
         </w:pict>
       </w:r>
     </w:p>
@@ -10473,7 +10518,7 @@
     <w:p>
       <w:r>
         <w:pict w14:anchorId="7C90BA02">
-          <v:rect id="_x0000_i1916" style="width:0;height:0" o:hralign="center" o:hrstd="t" o:hrnoshade="t" o:hr="t" fillcolor="black" stroked="f"/>
+          <v:rect id="_x0000_i1136" style="width:0;height:0" o:hralign="center" o:hrstd="t" o:hrnoshade="t" o:hr="t" fillcolor="black" stroked="f"/>
         </w:pict>
       </w:r>
     </w:p>
@@ -10569,7 +10614,7 @@
     <w:p>
       <w:r>
         <w:pict w14:anchorId="573CEC57">
-          <v:rect id="_x0000_i1917" style="width:0;height:0" o:hralign="center" o:hrstd="t" o:hrnoshade="t" o:hr="t" fillcolor="black" stroked="f"/>
+          <v:rect id="_x0000_i1137" style="width:0;height:0" o:hralign="center" o:hrstd="t" o:hrnoshade="t" o:hr="t" fillcolor="black" stroked="f"/>
         </w:pict>
       </w:r>
     </w:p>
@@ -10665,7 +10710,7 @@
     <w:p>
       <w:r>
         <w:pict w14:anchorId="5743AB22">
-          <v:rect id="_x0000_i1918" style="width:0;height:0" o:hralign="center" o:hrstd="t" o:hrnoshade="t" o:hr="t" fillcolor="black" stroked="f"/>
+          <v:rect id="_x0000_i1138" style="width:0;height:0" o:hralign="center" o:hrstd="t" o:hrnoshade="t" o:hr="t" fillcolor="black" stroked="f"/>
         </w:pict>
       </w:r>
     </w:p>
@@ -10750,7 +10795,7 @@
     <w:p>
       <w:r>
         <w:pict w14:anchorId="5A0915E9">
-          <v:rect id="_x0000_i1919" style="width:0;height:0" o:hralign="center" o:hrstd="t" o:hrnoshade="t" o:hr="t" fillcolor="black" stroked="f"/>
+          <v:rect id="_x0000_i1139" style="width:0;height:0" o:hralign="center" o:hrstd="t" o:hrnoshade="t" o:hr="t" fillcolor="black" stroked="f"/>
         </w:pict>
       </w:r>
     </w:p>
@@ -10846,7 +10891,7 @@
     <w:p>
       <w:r>
         <w:pict w14:anchorId="299A6E54">
-          <v:rect id="_x0000_i1920" style="width:0;height:0" o:hralign="center" o:hrstd="t" o:hrnoshade="t" o:hr="t" fillcolor="black" stroked="f"/>
+          <v:rect id="_x0000_i1140" style="width:0;height:0" o:hralign="center" o:hrstd="t" o:hrnoshade="t" o:hr="t" fillcolor="black" stroked="f"/>
         </w:pict>
       </w:r>
     </w:p>
@@ -10942,7 +10987,7 @@
     <w:p>
       <w:r>
         <w:pict w14:anchorId="24874876">
-          <v:rect id="_x0000_i1921" style="width:0;height:0" o:hralign="center" o:hrstd="t" o:hrnoshade="t" o:hr="t" fillcolor="black" stroked="f"/>
+          <v:rect id="_x0000_i1141" style="width:0;height:0" o:hralign="center" o:hrstd="t" o:hrnoshade="t" o:hr="t" fillcolor="black" stroked="f"/>
         </w:pict>
       </w:r>
     </w:p>
@@ -11016,7 +11061,7 @@
     <w:p>
       <w:r>
         <w:pict w14:anchorId="74F39654">
-          <v:rect id="_x0000_i1922" style="width:0;height:0" o:hralign="center" o:hrstd="t" o:hrnoshade="t" o:hr="t" fillcolor="black" stroked="f"/>
+          <v:rect id="_x0000_i1142" style="width:0;height:0" o:hralign="center" o:hrstd="t" o:hrnoshade="t" o:hr="t" fillcolor="black" stroked="f"/>
         </w:pict>
       </w:r>
     </w:p>
@@ -11026,7 +11071,22 @@
           <w:b/>
           <w:bCs/>
         </w:rPr>
-        <w:t>119. Among the given AWS services, which of the following services are supported by interface endpoints?</w:t>
+        <w:t xml:space="preserve">119. Among the given AWS services, which of the following services are supported by </w:t>
+      </w:r>
+      <w:r>
+        <w:rPr>
+          <w:b/>
+          <w:bCs/>
+          <w:highlight w:val="lightGray"/>
+        </w:rPr>
+        <w:t>interface endpoints</w:t>
+      </w:r>
+      <w:r>
+        <w:rPr>
+          <w:b/>
+          <w:bCs/>
+        </w:rPr>
+        <w:t>?</w:t>
       </w:r>
     </w:p>
     <w:p>
@@ -11057,9 +11117,31 @@
           <w:ilvl w:val="0"/>
           <w:numId w:val="127"/>
         </w:numPr>
-      </w:pPr>
-      <w:r>
-        <w:t>Amazon CloudWatch</w:t>
+        <w:rPr>
+          <w:highlight w:val="lightGray"/>
+        </w:rPr>
+      </w:pPr>
+      <w:r>
+        <w:rPr>
+          <w:b/>
+          <w:bCs/>
+          <w:highlight w:val="lightGray"/>
+        </w:rPr>
+        <w:t>Amazon</w:t>
+      </w:r>
+      <w:r>
+        <w:rPr>
+          <w:highlight w:val="lightGray"/>
+        </w:rPr>
+        <w:t xml:space="preserve"> </w:t>
+      </w:r>
+      <w:r>
+        <w:rPr>
+          <w:b/>
+          <w:bCs/>
+          <w:highlight w:val="lightGray"/>
+        </w:rPr>
+        <w:t>CloudWatch</w:t>
       </w:r>
     </w:p>
     <w:p>
@@ -11101,7 +11183,7 @@
     <w:p>
       <w:r>
         <w:pict w14:anchorId="3FDB0EF3">
-          <v:rect id="_x0000_i1923" style="width:0;height:0" o:hralign="center" o:hrstd="t" o:hrnoshade="t" o:hr="t" fillcolor="black" stroked="f"/>
+          <v:rect id="_x0000_i1143" style="width:0;height:0" o:hralign="center" o:hrstd="t" o:hrnoshade="t" o:hr="t" fillcolor="black" stroked="f"/>
         </w:pict>
       </w:r>
     </w:p>
@@ -11111,7 +11193,37 @@
           <w:b/>
           <w:bCs/>
         </w:rPr>
-        <w:t>120. Among the given AWS services, which of the following services are supported by gateway endpoints?</w:t>
+        <w:t xml:space="preserve">120. Among the given AWS services, which of the following services are </w:t>
+      </w:r>
+      <w:r>
+        <w:rPr>
+          <w:b/>
+          <w:bCs/>
+          <w:highlight w:val="yellow"/>
+        </w:rPr>
+        <w:t>supported</w:t>
+      </w:r>
+      <w:r>
+        <w:rPr>
+          <w:b/>
+          <w:bCs/>
+        </w:rPr>
+        <w:t xml:space="preserve"> by </w:t>
+      </w:r>
+      <w:r>
+        <w:rPr>
+          <w:b/>
+          <w:bCs/>
+          <w:highlight w:val="yellow"/>
+        </w:rPr>
+        <w:t>gateway endpoints</w:t>
+      </w:r>
+      <w:r>
+        <w:rPr>
+          <w:b/>
+          <w:bCs/>
+        </w:rPr>
+        <w:t>?</w:t>
       </w:r>
     </w:p>
     <w:p>
@@ -11120,8 +11232,14 @@
           <w:ilvl w:val="0"/>
           <w:numId w:val="128"/>
         </w:numPr>
-      </w:pPr>
-      <w:r>
+        <w:rPr>
+          <w:highlight w:val="yellow"/>
+        </w:rPr>
+      </w:pPr>
+      <w:r>
+        <w:rPr>
+          <w:highlight w:val="yellow"/>
+        </w:rPr>
         <w:t>Amazon S3</w:t>
       </w:r>
     </w:p>
@@ -11131,8 +11249,14 @@
           <w:ilvl w:val="0"/>
           <w:numId w:val="128"/>
         </w:numPr>
-      </w:pPr>
-      <w:r>
+        <w:rPr>
+          <w:highlight w:val="yellow"/>
+        </w:rPr>
+      </w:pPr>
+      <w:r>
+        <w:rPr>
+          <w:highlight w:val="yellow"/>
+        </w:rPr>
         <w:t>DynamoDB</w:t>
       </w:r>
     </w:p>
@@ -11241,7 +11365,7 @@
     <w:p>
       <w:r>
         <w:pict w14:anchorId="51D9529F">
-          <v:rect id="_x0000_i1924" style="width:0;height:0" o:hralign="center" o:hrstd="t" o:hrnoshade="t" o:hr="t" fillcolor="black" stroked="f"/>
+          <v:rect id="_x0000_i1144" style="width:0;height:0" o:hralign="center" o:hrstd="t" o:hrnoshade="t" o:hr="t" fillcolor="black" stroked="f"/>
         </w:pict>
       </w:r>
     </w:p>
@@ -11337,7 +11461,7 @@
     <w:p>
       <w:r>
         <w:pict w14:anchorId="19438F81">
-          <v:rect id="_x0000_i1925" style="width:0;height:0" o:hralign="center" o:hrstd="t" o:hrnoshade="t" o:hr="t" fillcolor="black" stroked="f"/>
+          <v:rect id="_x0000_i1145" style="width:0;height:0" o:hralign="center" o:hrstd="t" o:hrnoshade="t" o:hr="t" fillcolor="black" stroked="f"/>
         </w:pict>
       </w:r>
     </w:p>
@@ -11417,7 +11541,28 @@
     </w:p>
     <w:p>
       <w:r>
-        <w:t>You can create VPC flow logs at 3 levels which are:</w:t>
+        <w:t xml:space="preserve">You can create </w:t>
+      </w:r>
+      <w:r>
+        <w:rPr>
+          <w:b/>
+          <w:bCs/>
+        </w:rPr>
+        <w:t xml:space="preserve">VPC </w:t>
+      </w:r>
+      <w:r>
+        <w:t xml:space="preserve">flow logs at </w:t>
+      </w:r>
+      <w:r>
+        <w:rPr>
+          <w:b/>
+          <w:bCs/>
+          <w:highlight w:val="lightGray"/>
+        </w:rPr>
+        <w:t>3 levels</w:t>
+      </w:r>
+      <w:r>
+        <w:t xml:space="preserve"> which are:</w:t>
       </w:r>
     </w:p>
     <w:p>
@@ -11426,8 +11571,14 @@
           <w:ilvl w:val="0"/>
           <w:numId w:val="132"/>
         </w:numPr>
-      </w:pPr>
-      <w:r>
+        <w:rPr>
+          <w:highlight w:val="lightGray"/>
+        </w:rPr>
+      </w:pPr>
+      <w:r>
+        <w:rPr>
+          <w:highlight w:val="lightGray"/>
+        </w:rPr>
         <w:t>VPC</w:t>
       </w:r>
     </w:p>
@@ -11437,8 +11588,14 @@
           <w:ilvl w:val="0"/>
           <w:numId w:val="132"/>
         </w:numPr>
-      </w:pPr>
-      <w:r>
+        <w:rPr>
+          <w:highlight w:val="lightGray"/>
+        </w:rPr>
+      </w:pPr>
+      <w:r>
+        <w:rPr>
+          <w:highlight w:val="lightGray"/>
+        </w:rPr>
         <w:t>Subnet</w:t>
       </w:r>
     </w:p>
@@ -11448,8 +11605,14 @@
           <w:ilvl w:val="0"/>
           <w:numId w:val="132"/>
         </w:numPr>
-      </w:pPr>
-      <w:r>
+        <w:rPr>
+          <w:highlight w:val="lightGray"/>
+        </w:rPr>
+      </w:pPr>
+      <w:r>
+        <w:rPr>
+          <w:highlight w:val="lightGray"/>
+        </w:rPr>
         <w:t>Network Interface Level</w:t>
       </w:r>
     </w:p>
@@ -11466,7 +11629,7 @@
     <w:p>
       <w:r>
         <w:pict w14:anchorId="4FE5175D">
-          <v:rect id="_x0000_i1926" style="width:0;height:0" o:hralign="center" o:hrstd="t" o:hrnoshade="t" o:hr="t" fillcolor="black" stroked="f"/>
+          <v:rect id="_x0000_i1146" style="width:0;height:0" o:hralign="center" o:hrstd="t" o:hrnoshade="t" o:hr="t" fillcolor="black" stroked="f"/>
         </w:pict>
       </w:r>
     </w:p>
@@ -11551,7 +11714,7 @@
     <w:p>
       <w:r>
         <w:pict w14:anchorId="22BE19E9">
-          <v:rect id="_x0000_i1927" style="width:0;height:0" o:hralign="center" o:hrstd="t" o:hrnoshade="t" o:hr="t" fillcolor="black" stroked="f"/>
+          <v:rect id="_x0000_i1147" style="width:0;height:0" o:hralign="center" o:hrstd="t" o:hrnoshade="t" o:hr="t" fillcolor="black" stroked="f"/>
         </w:pict>
       </w:r>
     </w:p>
@@ -11647,7 +11810,7 @@
     <w:p>
       <w:r>
         <w:pict w14:anchorId="71F4D24A">
-          <v:rect id="_x0000_i1928" style="width:0;height:0" o:hralign="center" o:hrstd="t" o:hrnoshade="t" o:hr="t" fillcolor="black" stroked="f"/>
+          <v:rect id="_x0000_i1148" style="width:0;height:0" o:hralign="center" o:hrstd="t" o:hrnoshade="t" o:hr="t" fillcolor="black" stroked="f"/>
         </w:pict>
       </w:r>
     </w:p>
@@ -11743,7 +11906,7 @@
     <w:p>
       <w:r>
         <w:pict w14:anchorId="58344822">
-          <v:rect id="_x0000_i1929" style="width:0;height:0" o:hralign="center" o:hrstd="t" o:hrnoshade="t" o:hr="t" fillcolor="black" stroked="f"/>
+          <v:rect id="_x0000_i1149" style="width:0;height:0" o:hralign="center" o:hrstd="t" o:hrnoshade="t" o:hr="t" fillcolor="black" stroked="f"/>
         </w:pict>
       </w:r>
     </w:p>
@@ -11817,7 +11980,7 @@
     <w:p>
       <w:r>
         <w:pict w14:anchorId="68C025E1">
-          <v:rect id="_x0000_i1930" style="width:0;height:0" o:hralign="center" o:hrstd="t" o:hrnoshade="t" o:hr="t" fillcolor="black" stroked="f"/>
+          <v:rect id="_x0000_i1150" style="width:0;height:0" o:hralign="center" o:hrstd="t" o:hrnoshade="t" o:hr="t" fillcolor="black" stroked="f"/>
         </w:pict>
       </w:r>
     </w:p>
@@ -11913,7 +12076,7 @@
     <w:p>
       <w:r>
         <w:pict w14:anchorId="2E7A074D">
-          <v:rect id="_x0000_i1931" style="width:0;height:0" o:hralign="center" o:hrstd="t" o:hrnoshade="t" o:hr="t" fillcolor="black" stroked="f"/>
+          <v:rect id="_x0000_i1151" style="width:0;height:0" o:hralign="center" o:hrstd="t" o:hrnoshade="t" o:hr="t" fillcolor="black" stroked="f"/>
         </w:pict>
       </w:r>
     </w:p>
@@ -11987,7 +12150,7 @@
     <w:p>
       <w:r>
         <w:pict w14:anchorId="1A76D14B">
-          <v:rect id="_x0000_i1932" style="width:0;height:0" o:hralign="center" o:hrstd="t" o:hrnoshade="t" o:hr="t" fillcolor="black" stroked="f"/>
+          <v:rect id="_x0000_i1152" style="width:0;height:0" o:hralign="center" o:hrstd="t" o:hrnoshade="t" o:hr="t" fillcolor="black" stroked="f"/>
         </w:pict>
       </w:r>
     </w:p>
@@ -12083,7 +12246,7 @@
     <w:p>
       <w:r>
         <w:pict w14:anchorId="5B47E630">
-          <v:rect id="_x0000_i1933" style="width:0;height:0" o:hralign="center" o:hrstd="t" o:hrnoshade="t" o:hr="t" fillcolor="black" stroked="f"/>
+          <v:rect id="_x0000_i1153" style="width:0;height:0" o:hralign="center" o:hrstd="t" o:hrnoshade="t" o:hr="t" fillcolor="black" stroked="f"/>
         </w:pict>
       </w:r>
     </w:p>
@@ -12178,7 +12341,7 @@
     <w:p>
       <w:r>
         <w:pict w14:anchorId="7056A543">
-          <v:rect id="_x0000_i1934" style="width:0;height:0" o:hralign="center" o:hrstd="t" o:hrnoshade="t" o:hr="t" fillcolor="black" stroked="f"/>
+          <v:rect id="_x0000_i1154" style="width:0;height:0" o:hralign="center" o:hrstd="t" o:hrnoshade="t" o:hr="t" fillcolor="black" stroked="f"/>
         </w:pict>
       </w:r>
     </w:p>
@@ -29476,6 +29639,7 @@
   <w:style w:type="character" w:default="1" w:styleId="DefaultParagraphFont">
     <w:name w:val="Default Paragraph Font"/>
     <w:uiPriority w:val="1"/>
+    <w:semiHidden/>
     <w:unhideWhenUsed/>
   </w:style>
   <w:style w:type="table" w:default="1" w:styleId="TableNormal">

</xml_diff>